<commit_message>
feat: Add 'Memperhatikan' section to document generation and enhance PDF layout for consistency
</commit_message>
<xml_diff>
--- a/resources/templates/sk.docx
+++ b/resources/templates/sk.docx
@@ -358,7 +358,7 @@
       <w:tblPr>
         <w:tblStyle w:val="TableGrid"/>
         <w:tblpPr w:leftFromText="180" w:rightFromText="180" w:vertAnchor="text" w:horzAnchor="margin" w:tblpX="108" w:tblpY="201"/>
-        <w:tblW w:w="9072" w:type="dxa"/>
+        <w:tblW w:w="9220" w:type="dxa"/>
         <w:tblBorders>
           <w:top w:val="none" w:sz="0" w:space="0" w:color="auto"/>
           <w:left w:val="none" w:sz="0" w:space="0" w:color="auto"/>
@@ -378,7 +378,7 @@
       <w:tr>
         <w:tc>
           <w:tcPr>
-            <w:tcW w:w="1699" w:type="dxa"/>
+            <w:tcW w:w="2278" w:type="dxa"/>
           </w:tcPr>
           <w:p>
             <w:pPr>
@@ -391,7 +391,7 @@
         </w:tc>
         <w:tc>
           <w:tcPr>
-            <w:tcW w:w="426" w:type="dxa"/>
+            <w:tcW w:w="2247" w:type="dxa"/>
           </w:tcPr>
           <w:p>
             <w:r>
@@ -401,7 +401,7 @@
         </w:tc>
         <w:tc>
           <w:tcPr>
-            <w:tcW w:w="442" w:type="dxa"/>
+            <w:tcW w:w="2405" w:type="dxa"/>
           </w:tcPr>
           <w:p>
             <w:r>
@@ -411,7 +411,7 @@
         </w:tc>
         <w:tc>
           <w:tcPr>
-            <w:tcW w:w="6505" w:type="dxa"/>
+            <w:tcW w:w="2290" w:type="dxa"/>
           </w:tcPr>
           <w:p>
             <w:pPr>
@@ -432,11 +432,108 @@
         </w:tc>
       </w:tr>
     </w:tbl>
-    <w:p>
-      <w:pPr>
-        <w:jc w:val="center"/>
-      </w:pPr>
-    </w:p>
+    <w:p/>
+    <w:tbl>
+      <w:tblPr>
+        <w:tblStyle w:val="TableGrid"/>
+        <w:tblW w:w="9072" w:type="dxa"/>
+        <w:tblInd w:w="108" w:type="dxa"/>
+        <w:tblBorders>
+          <w:top w:val="none" w:sz="0" w:space="0" w:color="auto"/>
+          <w:left w:val="none" w:sz="0" w:space="0" w:color="auto"/>
+          <w:bottom w:val="none" w:sz="0" w:space="0" w:color="auto"/>
+          <w:right w:val="none" w:sz="0" w:space="0" w:color="auto"/>
+          <w:insideH w:val="none" w:sz="0" w:space="0" w:color="auto"/>
+          <w:insideV w:val="none" w:sz="0" w:space="0" w:color="auto"/>
+        </w:tblBorders>
+        <w:tblLook w:val="04A0" w:firstRow="1" w:lastRow="0" w:firstColumn="1" w:lastColumn="0" w:noHBand="0" w:noVBand="1"/>
+      </w:tblPr>
+      <w:tblGrid>
+        <w:gridCol w:w="2345"/>
+        <w:gridCol w:w="2281"/>
+        <w:gridCol w:w="2439"/>
+        <w:gridCol w:w="2324"/>
+      </w:tblGrid>
+      <w:tr>
+        <w:tc>
+          <w:tcPr>
+            <w:tcW w:w="1700" w:type="dxa"/>
+          </w:tcPr>
+          <w:p>
+            <w:pPr>
+              <w:ind w:left="-108"/>
+            </w:pPr>
+            <w:r>
+              <w:t>${</w:t>
+            </w:r>
+            <w:r>
+              <w:t>mmprhtkn</w:t>
+            </w:r>
+            <w:r>
+              <w:t>_head}</w:t>
+            </w:r>
+          </w:p>
+        </w:tc>
+        <w:tc>
+          <w:tcPr>
+            <w:tcW w:w="426" w:type="dxa"/>
+          </w:tcPr>
+          <w:p>
+            <w:r>
+              <w:t>${</w:t>
+            </w:r>
+            <w:r>
+              <w:t>mmprhtkn</w:t>
+            </w:r>
+            <w:r>
+              <w:t>_sep}</w:t>
+            </w:r>
+          </w:p>
+        </w:tc>
+        <w:tc>
+          <w:tcPr>
+            <w:tcW w:w="442" w:type="dxa"/>
+          </w:tcPr>
+          <w:p>
+            <w:r>
+              <w:t>${</w:t>
+            </w:r>
+            <w:r>
+              <w:t>mmprhtkn</w:t>
+            </w:r>
+            <w:r>
+              <w:t>_label}</w:t>
+            </w:r>
+          </w:p>
+        </w:tc>
+        <w:tc>
+          <w:tcPr>
+            <w:tcW w:w="6504" w:type="dxa"/>
+          </w:tcPr>
+          <w:p>
+            <w:pPr>
+              <w:jc w:val="both"/>
+            </w:pPr>
+            <w:r>
+              <w:rPr>
+                <w:szCs w:val="24"/>
+              </w:rPr>
+              <w:t>${</w:t>
+            </w:r>
+            <w:r>
+              <w:t>mmprhtkn</w:t>
+            </w:r>
+            <w:r>
+              <w:rPr>
+                <w:szCs w:val="24"/>
+              </w:rPr>
+              <w:t>_text}</w:t>
+            </w:r>
+          </w:p>
+        </w:tc>
+      </w:tr>
+    </w:tbl>
+    <w:p/>
     <w:p>
       <w:pPr>
         <w:jc w:val="center"/>
@@ -1934,7 +2031,7 @@
   <w:style w:type="paragraph" w:default="1" w:styleId="Normal">
     <w:name w:val="Normal"/>
     <w:qFormat/>
-    <w:rsid w:val="00944D24"/>
+    <w:rsid w:val="00114FBB"/>
   </w:style>
   <w:style w:type="paragraph" w:styleId="Heading6">
     <w:name w:val="heading 6"/>
@@ -1966,7 +2063,6 @@
   <w:style w:type="character" w:default="1" w:styleId="DefaultParagraphFont">
     <w:name w:val="Default Paragraph Font"/>
     <w:uiPriority w:val="1"/>
-    <w:semiHidden/>
     <w:unhideWhenUsed/>
   </w:style>
   <w:style w:type="table" w:default="1" w:styleId="TableNormal">

</xml_diff>